<commit_message>
feat(RiC-O): conformidad verificada contra la ontología oficial RiC-O 1.1
- ric/conformidad.py: validador contra ric/ontologia/RiC-O_1-1.rdf (clases y
  propiedades existentes, objeto/dato, dominio y rango con jerarquía y
  owl:unionOf).
- Atributos de tipo (20 de 42) como individuos de su clase RiC-O
  (rico:DocumentaryFormType, rico:ActivityType, rico:Language…), no como texto.
- Una sola URI por entidad con su clase precisa (herencia multitabla).
- URI …/ric/entidad/<tipo>/<id> que se abren: ficha para personas, RDF para
  programas (negociación de contenido), con sesión y visibilidad por rol.
- Cada exportación informa su conformidad; comando verificar_rico, también en
  el despliegue. 13 pruebas nuevas; documentación y manual actualizados.

Co-Authored-By: Claude Opus 5.5 <noreply@anthropic.com>
Claude-Session: https://claude.ai/code/session_01DPbqXXn1CAg8rdpv4qL9hL
</commit_message>
<xml_diff>
--- a/plataforma/documentacion/RICORA_Manual_de_usuario_y_aplicacion_RiC.docx
+++ b/plataforma/documentacion/RICORA_Manual_de_usuario_y_aplicacion_RiC.docx
@@ -10616,7 +10616,7 @@
           <w:sz w:val="17"/>
           <w:szCs w:val="17"/>
         </w:rPr>
-        <w:t xml:space="preserve">&lt;https://ricora.example/activity/1&gt; a rico:Activity ;</w:t>
+        <w:t xml:space="preserve">&lt;https://ricora.example/ric/entidad/activity/1&gt; a rico:Activity ;</w:t>
       </w:r>
     </w:p>
     <w:p>
@@ -10632,7 +10632,7 @@
           <w:sz w:val="17"/>
           <w:szCs w:val="17"/>
         </w:rPr>
-        <w:t xml:space="preserve">    rico:isOrWasSubjectOf &lt;https://ricora.example/record/6&gt; ;</w:t>
+        <w:t xml:space="preserve">    rico:isOrWasSubjectOf &lt;https://ricora.example/ric/entidad/record/6&gt; ;</w:t>
       </w:r>
     </w:p>
     <w:p>
@@ -10680,7 +10680,7 @@
           <w:sz w:val="17"/>
           <w:szCs w:val="17"/>
         </w:rPr>
-        <w:t xml:space="preserve">&lt;https://ricora.example/person/7&gt; a rico:Person ;</w:t>
+        <w:t xml:space="preserve">&lt;https://ricora.example/ric/entidad/person/7&gt; a rico:Person ;</w:t>
       </w:r>
     </w:p>
     <w:p>
@@ -10696,7 +10696,7 @@
           <w:sz w:val="17"/>
           <w:szCs w:val="17"/>
         </w:rPr>
-        <w:t xml:space="preserve">    rico:isAuthorOf &lt;https://ricora.example/record/6&gt; ;</w:t>
+        <w:t xml:space="preserve">    rico:isAuthorOf &lt;https://ricora.example/ric/entidad/record/6&gt; ;</w:t>
       </w:r>
     </w:p>
     <w:p>
@@ -10744,7 +10744,7 @@
           <w:sz w:val="17"/>
           <w:szCs w:val="17"/>
         </w:rPr>
-        <w:t xml:space="preserve">&lt;https://ricora.example/record/6&gt; a rico:Record ;</w:t>
+        <w:t xml:space="preserve">&lt;https://ricora.example/ric/entidad/tipo/DocumentaryFormType/acta&gt; a rico:DocumentaryFormType ;</w:t>
       </w:r>
     </w:p>
     <w:p>
@@ -10760,7 +10760,7 @@
           <w:sz w:val="17"/>
           <w:szCs w:val="17"/>
         </w:rPr>
-        <w:t xml:space="preserve">    rico:hasAuthor &lt;https://ricora.example/person/7&gt; ;</w:t>
+        <w:t xml:space="preserve">    rico:name "acta" .</w:t>
       </w:r>
     </w:p>
     <w:p>
@@ -10776,7 +10776,7 @@
           <w:sz w:val="17"/>
           <w:szCs w:val="17"/>
         </w:rPr>
-        <w:t xml:space="preserve">    rico:hasDocumentaryFormType "acta" ;</w:t>
+        <w:t xml:space="preserve"> </w:t>
       </w:r>
     </w:p>
     <w:p>
@@ -10792,7 +10792,7 @@
           <w:sz w:val="17"/>
           <w:szCs w:val="17"/>
         </w:rPr>
-        <w:t xml:space="preserve">    rico:hasOrHadSubject &lt;https://ricora.example/activity/1&gt; ;</w:t>
+        <w:t xml:space="preserve">&lt;https://ricora.example/ric/entidad/record/6&gt; a rico:Record ;</w:t>
       </w:r>
     </w:p>
     <w:p>
@@ -10808,6 +10808,54 @@
           <w:sz w:val="17"/>
           <w:szCs w:val="17"/>
         </w:rPr>
+        <w:t xml:space="preserve">    rico:hasAuthor &lt;https://ricora.example/ric/entidad/person/7&gt; ;</w:t>
+      </w:r>
+    </w:p>
+    <w:p>
+      <w:pPr>
+        <w:keepLines/>
+        <w:shd w:fill="EEF1F6" w:color="auto" w:val="clear"/>
+        <w:spacing w:after="0" w:line="240"/>
+        <w:ind w:left="200" w:right="200"/>
+      </w:pPr>
+      <w:r>
+        <w:rPr>
+          <w:rFonts w:ascii="Courier New" w:cs="Courier New" w:eastAsia="Courier New" w:hAnsi="Courier New"/>
+          <w:sz w:val="17"/>
+          <w:szCs w:val="17"/>
+        </w:rPr>
+        <w:t xml:space="preserve">    rico:hasDocumentaryFormType &lt;https://ricora.example/ric/entidad/tipo/DocumentaryFormType/acta&gt; ;</w:t>
+      </w:r>
+    </w:p>
+    <w:p>
+      <w:pPr>
+        <w:keepLines/>
+        <w:shd w:fill="EEF1F6" w:color="auto" w:val="clear"/>
+        <w:spacing w:after="0" w:line="240"/>
+        <w:ind w:left="200" w:right="200"/>
+      </w:pPr>
+      <w:r>
+        <w:rPr>
+          <w:rFonts w:ascii="Courier New" w:cs="Courier New" w:eastAsia="Courier New" w:hAnsi="Courier New"/>
+          <w:sz w:val="17"/>
+          <w:szCs w:val="17"/>
+        </w:rPr>
+        <w:t xml:space="preserve">    rico:hasOrHadSubject &lt;https://ricora.example/ric/entidad/activity/1&gt; ;</w:t>
+      </w:r>
+    </w:p>
+    <w:p>
+      <w:pPr>
+        <w:keepLines/>
+        <w:shd w:fill="EEF1F6" w:color="auto" w:val="clear"/>
+        <w:spacing w:after="0" w:line="240"/>
+        <w:ind w:left="200" w:right="200"/>
+      </w:pPr>
+      <w:r>
+        <w:rPr>
+          <w:rFonts w:ascii="Courier New" w:cs="Courier New" w:eastAsia="Courier New" w:hAnsi="Courier New"/>
+          <w:sz w:val="17"/>
+          <w:szCs w:val="17"/>
+        </w:rPr>
         <w:t xml:space="preserve">    rico:name "Acta del Cabildo de Santafé, 20 de julio de 1810" .</w:t>
       </w:r>
     </w:p>
@@ -10834,7 +10882,17 @@
         <w:t xml:space="preserve">rico:Record</w:t>
       </w:r>
       <w:r>
-        <w:t xml:space="preserve"> con su forma documental, que </w:t>
+        <w:t xml:space="preserve"> cuya forma documental es un individuo de la clase </w:t>
+      </w:r>
+      <w:r>
+        <w:rPr>
+          <w:b/>
+          <w:bCs/>
+        </w:rPr>
+        <w:t xml:space="preserve">rico:DocumentaryFormType</w:t>
+      </w:r>
+      <w:r>
+        <w:t xml:space="preserve"> (no un texto suelto, como exige RiC-O), que </w:t>
       </w:r>
       <w:r>
         <w:rPr>
@@ -10949,10 +11007,10 @@
           <w:b/>
           <w:bCs/>
         </w:rPr>
-        <w:t xml:space="preserve">Validación formal de la exportación:</w:t>
-      </w:r>
-      <w:r>
-        <w:t xml:space="preserve"> hoy se verifica que el archivo RiC-O se pueda volver a leer y que contenga todos los documentos pedidos; no hay validación SHACL contra la ontología.</w:t>
+        <w:t xml:space="preserve">Datos enlazados abiertos:</w:t>
+      </w:r>
+      <w:r>
+        <w:t xml:space="preserve"> cada entidad tiene una URI que se abre (ficha para las personas, RiC-O para los programas), pero exige sesión; abrirla al público es una decisión institucional.</w:t>
       </w:r>
     </w:p>
     <w:p>
@@ -12081,17 +12139,37 @@
         <w:spacing w:after="120" w:line="300"/>
       </w:pPr>
       <w:r>
-        <w:t xml:space="preserve">Toda la descripción validada se exporta en RiC-O 1.1 (Turtle, RDF/XML, N3, JSON-LD) y en CSV. Cada exportación se verifica (se vuelve a leer), recibe su huella SHA-256 y queda registrada. Sobre el mismo grafo se pueden hacer </w:t>
+        <w:t xml:space="preserve">Toda la descripción validada se exporta en RiC-O 1.1 (Turtle, RDF/XML, N3, JSON-LD) y en CSV. Cada exportación se vuelve a leer y se </w:t>
       </w:r>
       <w:r>
         <w:rPr>
           <w:b/>
           <w:bCs/>
         </w:rPr>
+        <w:t xml:space="preserve">verifica contra la ontología oficial RiC-O 1.1</w:t>
+      </w:r>
+      <w:r>
+        <w:t xml:space="preserve"> (que cada clase y propiedad exista, que las propiedades de objeto apunten a entidades y las de dato a textos, y que se respeten dominio y rango), recibe su huella SHA-256 y queda registrada. Los atributos de tipo (forma documental, tipo de actividad, idioma…) se exportan como individuos de su clase RiC-O, y cada entidad tiene una </w:t>
+      </w:r>
+      <w:r>
+        <w:rPr>
+          <w:b/>
+          <w:bCs/>
+        </w:rPr>
+        <w:t xml:space="preserve">URI que se abre</w:t>
+      </w:r>
+      <w:r>
+        <w:t xml:space="preserve">: lleva a su ficha o entrega su RDF. Sobre el mismo grafo se pueden hacer </w:t>
+      </w:r>
+      <w:r>
+        <w:rPr>
+          <w:b/>
+          <w:bCs/>
+        </w:rPr>
         <w:t xml:space="preserve">consultas SPARQL</w:t>
       </w:r>
       <w:r>
-        <w:t xml:space="preserve"> de solo lectura desde la plataforma, respetando lo que cada rol puede ver.</w:t>
+        <w:t xml:space="preserve"> de solo lectura, respetando lo que cada rol puede ver.</w:t>
       </w:r>
     </w:p>
     <w:p>
@@ -12207,7 +12285,7 @@
         <w:spacing w:after="80" w:line="290"/>
       </w:pPr>
       <w:r>
-        <w:t xml:space="preserve">Exportación de las relaciones reificadas (rico:Relation con certeza, descripción y fuente) y validación SHACL.</w:t>
+        <w:t xml:space="preserve">Exportación de las relaciones reificadas (rico:Relation con fechas de vigencia, certeza, descripción y fuente).</w:t>
       </w:r>
     </w:p>
     <w:p>

</xml_diff>